<commit_message>
Add self-contained study PDFs and family materials
</commit_message>
<xml_diff>
--- a/deliverables/Loesungen_Broschuere_Pruefung_1_DE_ES.docx
+++ b/deliverables/Loesungen_Broschuere_Pruefung_1_DE_ES.docx
@@ -55,7 +55,7 @@
           <w:color w:val="2B5163"/>
           <w:sz w:val="30"/>
         </w:rPr>
-        <w:t>Antwortschlüssel zu den fotografierten Arbeitsblättern</w:t>
+        <w:t>Selbstständig verständliche Lösungen und Lernantworten</w:t>
       </w:r>
     </w:p>
     <w:p>
@@ -189,7 +189,7 @@
               <w:br/>
             </w:r>
             <w:r>
-              <w:t>Gelöst werden die auf den Fotos sichtbaren Aufgaben, soweit sie für Prüfung Teil 1 oder den gemeinsamen Überblick relevant sind. Offene persönliche Fragen haben keine einzige richtige Lösung.</w:t>
+              <w:t>Gelöst werden die Unterrichtsaufgaben, soweit sie für Prüfung Teil 1 oder den gemeinsamen Überblick relevant sind. Jede Überschrift beschreibt die Aufgabe in Worten; alle Kernaussagen stehen direkt in diesem Dokument. Es werden weder Fotodateien noch Bildnummern benötigt. Offene persönliche Fragen haben keine einzige richtige Lösung.</w:t>
             </w:r>
           </w:p>
         </w:tc>
@@ -204,14 +204,6 @@
           <w:b w:val="0"/>
           <w:i w:val="0"/>
         </w:rPr>
-      </w:r>
-    </w:p>
-    <w:p>
-      <w:pPr>
-        <w:pStyle w:val="ListBullet"/>
-      </w:pPr>
-      <w:r>
-        <w:t>Die Bildnummern beziehen sich auf die heruntergeladenen Fotos (IMG_2394 bis IMG_2414).</w:t>
       </w:r>
     </w:p>
     <w:p>
@@ -240,7 +232,7 @@
         <w:pStyle w:val="Heading1"/>
       </w:pPr>
       <w:r>
-        <w:t>1. Lernziele (IMG_2394)</w:t>
+        <w:t>1. Lernziele für Prüfung Teil 1</w:t>
       </w:r>
     </w:p>
     <w:p>
@@ -381,7 +373,7 @@
         <w:pStyle w:val="Heading1"/>
       </w:pPr>
       <w:r>
-        <w:t>2. Lückentext Weltreligionen (IMG_2399–2402)</w:t>
+        <w:t>2. Lückentext: Grundwissen zu Weltreligionen</w:t>
       </w:r>
     </w:p>
     <w:p>
@@ -597,6 +589,23 @@
       </w:r>
     </w:p>
     <w:p>
+      <w:pPr>
+        <w:pStyle w:val="Heading2"/>
+      </w:pPr>
+      <w:r>
+        <w:t>Vollständige Kernaussage ohne Lückentext</w:t>
+      </w:r>
+    </w:p>
+    <w:p>
+      <w:r>
+        <w:rPr>
+          <w:b w:val="0"/>
+          <w:i w:val="0"/>
+        </w:rPr>
+        <w:t>Das Wort Religion hat einen lateinischen Ursprung. Viele Religionen beziehen sich auf eine höhere Macht oder auf das Heilige; solche Glaubensaussagen lassen sich nicht wie naturwissenschaftliche Aussagen beweisen. Religion kann Menschen Halt geben. Zu den fünf Weltreligionen zählen Christentum, Islam, Judentum, Hinduismus und Buddhismus. Monotheistische Religionen glauben an einen Gott; Polytheismus bezeichnet den Glauben an mehrere Gottheiten. Religionen prägen Wertvorstellungen, Charakter und Verhalten. Sichtbar werden sie auch in Bauten wie Kirche, Moschee und Synagoge sowie in Festen und Vorstellungen über Leben und Tod. Menschen dürfen ihren Glauben frei wählen oder keiner Religion angehören. Andere Überzeugungen sollen respektiert und Menschen fair behandelt werden.</w:t>
+      </w:r>
+    </w:p>
+    <w:p>
       <w:r>
         <w:br w:type="page"/>
       </w:r>
@@ -606,7 +615,7 @@
         <w:pStyle w:val="Heading1"/>
       </w:pPr>
       <w:r>
-        <w:t>3. Fragen zum Grundtext (IMG_2403)</w:t>
+        <w:t>3. Verständnisfragen zum Grundtext</w:t>
       </w:r>
     </w:p>
     <w:p>
@@ -754,7 +763,7 @@
         <w:pStyle w:val="Heading1"/>
       </w:pPr>
       <w:r>
-        <w:t>4. Karte und Symbole (IMG_2404–2405)</w:t>
+        <w:t>4. Weltkarte: Farben, Symbole und Verbreitung</w:t>
       </w:r>
     </w:p>
     <w:tbl>
@@ -1347,7 +1356,7 @@
         <w:pStyle w:val="Heading1"/>
       </w:pPr>
       <w:r>
-        <w:t>5. 100er-Grafik (IMG_2406)</w:t>
+        <w:t>5. 100er-Grafik zur religiösen Zugehörigkeit</w:t>
       </w:r>
     </w:p>
     <w:tbl>
@@ -2003,7 +2012,7 @@
         <w:pStyle w:val="Heading1"/>
       </w:pPr>
       <w:r>
-        <w:t>6. Fragen der Religionen (IMG_2407)</w:t>
+        <w:t>6. Persönliche Sinn- und Glaubensfragen</w:t>
       </w:r>
     </w:p>
     <w:p>
@@ -2328,7 +2337,7 @@
         <w:pStyle w:val="Heading1"/>
       </w:pPr>
       <w:r>
-        <w:t>7. Übersichtstabelle (IMG_2408–2409)</w:t>
+        <w:t>7. Vergleichstabelle der fünf Weltreligionen</w:t>
       </w:r>
     </w:p>
     <w:tbl>
@@ -3315,7 +3324,7 @@
         <w:pStyle w:val="Heading1"/>
       </w:pPr>
       <w:r>
-        <w:t>8. Jesus (IMG_2395–2397)</w:t>
+        <w:t>8. Aufgaben zu Jesus und dem Christentum</w:t>
       </w:r>
     </w:p>
     <w:tbl>
@@ -3707,7 +3716,7 @@
         <w:pStyle w:val="Heading1"/>
       </w:pPr>
       <w:r>
-        <w:t>9. Allah und Mohammed (IMG_2412–2414)</w:t>
+        <w:t>9. Aufgaben zu Allah, Mohammed und dem Islam</w:t>
       </w:r>
     </w:p>
     <w:p>
@@ -5661,7 +5670,7 @@
           <w:b w:val="0"/>
           <w:i w:val="0"/>
         </w:rPr>
-        <w:t>Grundlage: die vom Benutzer bereitgestellten Fotos des Klassenmaterials. Fachlicher Abgleich: Lehrplan 21 Kanton Zug, NMG.12.1, NMG.12.2 und NMG.12.5 (zg.lehrplan.ch). Die Lösungen folgen dem Prüfungswortschatz des Hefts und markieren sachliche Vereinfachungen.</w:t>
+        <w:t>Grundlage: die bereitgestellten Klassenmaterialien. Fachlicher Abgleich: Lehrplan 21 Kanton Zug, NMG.12.1, NMG.12.2 und NMG.12.5 (zg.lehrplan.ch). Die Lösungen folgen dem Prüfungswortschatz des Hefts und markieren sachliche Vereinfachungen.</w:t>
       </w:r>
     </w:p>
     <w:sectPr>

</xml_diff>